<commit_message>
Actualizacion de documentacion y reglas de entorno
</commit_message>
<xml_diff>
--- a/docs/Glosario_Datos_Barberia_v1.docx
+++ b/docs/Glosario_Datos_Barberia_v1.docx
@@ -49,6 +49,11 @@
           <w:color w:val="1F3864"/>
         </w:rPr>
         <w:t>1. Propósito de este documento</w:t>
+      </w:r>
+    </w:p>
+    <w:p>
+      <w:r>
+        <w:t>**Nota de corrección (10/09/2026):** las claves primarias y foráneas de este glosario se documentaron originalmente como `uuid`. Durante la implementación de HU-TUR-01 se detectó que Cliente y Usuario ya existían en el código con `id` tipo `bigint` autoincremental (el default de Laravel), y no tenía sentido migrar retroactivamente HU-SEG-01/HU-CLI-01/HU-SER-01 ya cerradas. Se decidió adoptar `bigint` como estándar del proyecto y corregir este documento para que sea la fuente de verdad real. La arquitectura multi-tenant-ready (ADR-03) no depende del tipo de dato de la PK, solo de que `barberia_id` exista como FK — este cambio no la afecta.</w:t>
       </w:r>
     </w:p>
     <w:p>
@@ -204,7 +209,7 @@
                 <w:i/>
                 <w:sz w:val="20"/>
               </w:rPr>
-              <w:t>uuid (PK)</w:t>
+              <w:t>bigint (PK)</w:t>
             </w:r>
           </w:p>
         </w:tc>
@@ -522,7 +527,7 @@
                 <w:i/>
                 <w:sz w:val="20"/>
               </w:rPr>
-              <w:t>uuid (PK)</w:t>
+              <w:t>bigint (PK)</w:t>
             </w:r>
           </w:p>
         </w:tc>
@@ -576,7 +581,7 @@
                 <w:i/>
                 <w:sz w:val="20"/>
               </w:rPr>
-              <w:t>uuid (FK)</w:t>
+              <w:t>bigint (FK)</w:t>
             </w:r>
           </w:p>
         </w:tc>
@@ -948,7 +953,7 @@
                 <w:i/>
                 <w:sz w:val="20"/>
               </w:rPr>
-              <w:t>uuid (PK)</w:t>
+              <w:t>bigint (PK)</w:t>
             </w:r>
           </w:p>
         </w:tc>
@@ -1002,7 +1007,7 @@
                 <w:i/>
                 <w:sz w:val="20"/>
               </w:rPr>
-              <w:t>uuid (FK)</w:t>
+              <w:t>bigint (FK)</w:t>
             </w:r>
           </w:p>
         </w:tc>
@@ -1320,7 +1325,7 @@
                 <w:i/>
                 <w:sz w:val="20"/>
               </w:rPr>
-              <w:t>uuid (PK)</w:t>
+              <w:t>bigint (PK)</w:t>
             </w:r>
           </w:p>
         </w:tc>
@@ -1374,7 +1379,7 @@
                 <w:i/>
                 <w:sz w:val="20"/>
               </w:rPr>
-              <w:t>uuid (FK)</w:t>
+              <w:t>bigint (FK)</w:t>
             </w:r>
           </w:p>
         </w:tc>
@@ -1638,7 +1643,7 @@
                 <w:i/>
                 <w:sz w:val="20"/>
               </w:rPr>
-              <w:t>uuid (PK)</w:t>
+              <w:t>bigint (PK)</w:t>
             </w:r>
           </w:p>
         </w:tc>
@@ -1692,7 +1697,7 @@
                 <w:i/>
                 <w:sz w:val="20"/>
               </w:rPr>
-              <w:t>uuid (FK)</w:t>
+              <w:t>bigint (FK)</w:t>
             </w:r>
           </w:p>
         </w:tc>
@@ -2064,7 +2069,7 @@
                 <w:i/>
                 <w:sz w:val="20"/>
               </w:rPr>
-              <w:t>uuid (PK)</w:t>
+              <w:t>bigint (PK)</w:t>
             </w:r>
           </w:p>
         </w:tc>
@@ -2118,7 +2123,7 @@
                 <w:i/>
                 <w:sz w:val="20"/>
               </w:rPr>
-              <w:t>uuid (FK)</w:t>
+              <w:t>bigint (FK)</w:t>
             </w:r>
           </w:p>
         </w:tc>
@@ -2328,7 +2333,7 @@
                 <w:i/>
                 <w:sz w:val="20"/>
               </w:rPr>
-              <w:t>uuid (PK)</w:t>
+              <w:t>bigint (PK)</w:t>
             </w:r>
           </w:p>
         </w:tc>
@@ -2382,7 +2387,7 @@
                 <w:i/>
                 <w:sz w:val="20"/>
               </w:rPr>
-              <w:t>uuid (FK)</w:t>
+              <w:t>bigint (FK)</w:t>
             </w:r>
           </w:p>
         </w:tc>
@@ -2538,7 +2543,7 @@
                 <w:i/>
                 <w:sz w:val="20"/>
               </w:rPr>
-              <w:t>uuid (PK)</w:t>
+              <w:t>bigint (PK)</w:t>
             </w:r>
           </w:p>
         </w:tc>
@@ -2592,7 +2597,7 @@
                 <w:i/>
                 <w:sz w:val="20"/>
               </w:rPr>
-              <w:t>uuid (FK)</w:t>
+              <w:t>bigint (FK)</w:t>
             </w:r>
           </w:p>
         </w:tc>
@@ -2646,7 +2651,7 @@
                 <w:i/>
                 <w:sz w:val="20"/>
               </w:rPr>
-              <w:t>uuid (FK)</w:t>
+              <w:t>bigint (FK)</w:t>
             </w:r>
           </w:p>
         </w:tc>
@@ -2802,7 +2807,7 @@
                 <w:i/>
                 <w:sz w:val="20"/>
               </w:rPr>
-              <w:t>uuid (PK)</w:t>
+              <w:t>bigint (PK)</w:t>
             </w:r>
           </w:p>
         </w:tc>
@@ -2856,7 +2861,7 @@
                 <w:i/>
                 <w:sz w:val="20"/>
               </w:rPr>
-              <w:t>uuid (FK)</w:t>
+              <w:t>bigint (FK)</w:t>
             </w:r>
           </w:p>
         </w:tc>
@@ -3174,7 +3179,7 @@
                 <w:i/>
                 <w:sz w:val="20"/>
               </w:rPr>
-              <w:t>uuid (PK)</w:t>
+              <w:t>bigint (PK)</w:t>
             </w:r>
           </w:p>
         </w:tc>
@@ -3228,7 +3233,7 @@
                 <w:i/>
                 <w:sz w:val="20"/>
               </w:rPr>
-              <w:t>uuid (FK)</w:t>
+              <w:t>bigint (FK)</w:t>
             </w:r>
           </w:p>
         </w:tc>
@@ -3282,7 +3287,7 @@
                 <w:i/>
                 <w:sz w:val="20"/>
               </w:rPr>
-              <w:t>uuid (FK)</w:t>
+              <w:t>bigint (FK)</w:t>
             </w:r>
           </w:p>
         </w:tc>
@@ -3492,7 +3497,7 @@
                 <w:i/>
                 <w:sz w:val="20"/>
               </w:rPr>
-              <w:t>uuid (PK)</w:t>
+              <w:t>bigint (PK)</w:t>
             </w:r>
           </w:p>
         </w:tc>
@@ -3546,7 +3551,7 @@
                 <w:i/>
                 <w:sz w:val="20"/>
               </w:rPr>
-              <w:t>uuid (FK)</w:t>
+              <w:t>bigint (FK)</w:t>
             </w:r>
           </w:p>
         </w:tc>
@@ -3600,7 +3605,7 @@
                 <w:i/>
                 <w:sz w:val="20"/>
               </w:rPr>
-              <w:t>uuid (FK)</w:t>
+              <w:t>bigint (FK)</w:t>
             </w:r>
           </w:p>
         </w:tc>
@@ -3654,7 +3659,7 @@
                 <w:i/>
                 <w:sz w:val="20"/>
               </w:rPr>
-              <w:t>uuid (FK)</w:t>
+              <w:t>bigint (FK)</w:t>
             </w:r>
           </w:p>
         </w:tc>
@@ -3708,7 +3713,7 @@
                 <w:i/>
                 <w:sz w:val="20"/>
               </w:rPr>
-              <w:t>uuid (FK)</w:t>
+              <w:t>bigint (FK)</w:t>
             </w:r>
           </w:p>
         </w:tc>
@@ -4026,7 +4031,7 @@
                 <w:i/>
                 <w:sz w:val="20"/>
               </w:rPr>
-              <w:t>uuid (PK)</w:t>
+              <w:t>bigint (PK)</w:t>
             </w:r>
           </w:p>
         </w:tc>
@@ -4080,7 +4085,7 @@
                 <w:i/>
                 <w:sz w:val="20"/>
               </w:rPr>
-              <w:t>uuid (FK)</w:t>
+              <w:t>bigint (FK)</w:t>
             </w:r>
           </w:p>
         </w:tc>
@@ -4134,7 +4139,7 @@
                 <w:i/>
                 <w:sz w:val="20"/>
               </w:rPr>
-              <w:t>uuid (FK)</w:t>
+              <w:t>bigint (FK)</w:t>
             </w:r>
           </w:p>
         </w:tc>

</xml_diff>